<commit_message>
docs: add sample inputs and performance test script
</commit_message>
<xml_diff>
--- a/sample/docs/SRS_Document-1.docx
+++ b/sample/docs/SRS_Document-1.docx
@@ -156,7 +156,7 @@
     </w:p>
     <w:p>
       <w:r>
-        <w:t>- OTP-based login (NOC from existing customer field is mandatory and Proceed button is disabled until filled)</w:t>
+        <w:t>- OTP-based login (NOC from existing customer field is mandatory but Proceed button is enabled)</w:t>
       </w:r>
     </w:p>
     <w:p>
@@ -354,7 +354,7 @@
     </w:p>
     <w:p>
       <w:r>
-        <w:t>Defines the corrected system design. If blank documents for S3_Regression_Documents are not available for upload by BDA, they should be made available in the backend system. This addresses the issue of undefined error when trying to enroll against open TV in CPO mobile app and ensures the Proceed button is disabled until all mandatory fields are filled. This addresses the issue of OTP verification pop-up time mismatch and ensures proper synchronization. Additionally, the system should allow regularization through distributors for Demise Within Family cases. The Ekyc tile update issue is addressed by ensuring the tile is not grayed out in S1, and it remains active and accessible. This fixes the issue of 128975 - Spell correction. This also addresses the issue of 130902 - Warranty Check box is not greyed out. If blank documents for S3_Regression_Documents are not available for upload by BDA, they should be made available in the backend system. This addresses the issue of undefined error when trying to enroll against open TV in CPO mobile app and ensures the Proceed button is disabled until all mandatory fields are filled. This addresses the issue of OTP verification pop-up time mismatch and ensures proper synchronization. Additionally, the system should allow regularization through distributors for Demise Within Family cases. The Ekyc tile update issue is addressed by ensuring the tile is not grayed out in S1, and it remains active and accessible. This fixes the issue of 128975 - Spell correction. This also addresses the issue of 130902 - Warranty Check box is not greyed out.</w:t>
+        <w:t>Defines the corrected system design. If blank documents for S3_Regression_Documents are not available for upload by BDA, they should be made available in the backend system. This addresses the issue of undefined error when trying to enroll against open TV in CEP mobile app and ensures the Proceed button is disabled until all mandatory fields are filled. This addresses the issue of OTP verification pop-up time mismatch and ensures proper synchronization. Additionally, the system should allow regularization through alternate distributors for Demise Within Family cases. The Ekyc tile update issue is addressed by ensuring the tile is not grayed out in S1, and it remains active and accessible. This fixes the issue of 128975 - Spell correction. This also addresses the issue of 130902 - Warranty Check box is not greyed out. If product is not present in CEP but present in SAP, the system should show an entry. If blank documents for S3_Regression_Documents are not available for upload by BDA, they should be made available in the backend system.</w:t>
       </w:r>
     </w:p>
     <w:p/>

</xml_diff>